<commit_message>
Close remaining T15 follow-ups: plan-vs-actual writeup, regenerate UML_Diagrams.docx
- PLAN.md: fill in section 7 (plan vs. actual) from real commit history
- diagrams/DIAGRAMS.md + UML_Diagrams.docx: sync class diagram section
  with SlotInfo/RuleContext, added during T9 but missed in the T15 docx export
- HANDOVER.md: remove the now-resolved diagram-staleness gap
</commit_message>
<xml_diff>
--- a/diagrams/UML_Diagrams.docx
+++ b/diagrams/UML_Diagrams.docx
@@ -22,7 +22,7 @@
           <w:sz w:val="18"/>
           <w:szCs w:val="18"/>
         </w:rPr>
-        <w:t xml:space="preserve">EAIS-HR-2159-TA-01 — companion to PLAN.md and ARCHITECTURE.md</w:t>
+        <w:t xml:space="preserve">EAIS-HR-2159-TA-01 — companion to PLAN.md and ARCHITECTURE.md (regenerated post-T15, includes SlotInfo/RuleContext)</w:t>
       </w:r>
     </w:p>
     <w:p>
@@ -227,7 +227,7 @@
       <w:r>
         <w:drawing>
           <wp:inline distT="0" distB="0" distL="0" distR="0">
-            <wp:extent cx="5905500" cy="3429000"/>
+            <wp:extent cx="5334000" cy="3619500"/>
             <wp:effectExtent t="0" r="0" b="0" l="0"/>
             <wp:docPr id="1" name="" descr="" title=""/>
             <wp:cNvGraphicFramePr>
@@ -252,7 +252,7 @@
                   <pic:spPr bwMode="auto">
                     <a:xfrm>
                       <a:off x="0" y="0"/>
-                      <a:ext cx="5905500" cy="3429000"/>
+                      <a:ext cx="5334000" cy="3619500"/>
                     </a:xfrm>
                     <a:prstGeom prst="rect">
                       <a:avLst/>
@@ -472,7 +472,7 @@
       <w:r>
         <w:drawing>
           <wp:inline distT="0" distB="0" distL="0" distR="0">
-            <wp:extent cx="5905500" cy="1714500"/>
+            <wp:extent cx="5905500" cy="1666875"/>
             <wp:effectExtent t="0" r="0" b="0" l="0"/>
             <wp:docPr id="1" name="" descr="" title=""/>
             <wp:cNvGraphicFramePr>
@@ -497,7 +497,7 @@
                   <pic:spPr bwMode="auto">
                     <a:xfrm>
                       <a:off x="0" y="0"/>
-                      <a:ext cx="5905500" cy="1714500"/>
+                      <a:ext cx="5905500" cy="1666875"/>
                     </a:xfrm>
                     <a:prstGeom prst="rect">
                       <a:avLst/>
@@ -569,6 +569,21 @@
       </w:r>
       <w:r>
         <w:t xml:space="preserve">, not by branching inside the core on "are we in test mode."</w:t>
+      </w:r>
+    </w:p>
+    <w:p>
+      <w:pPr>
+        <w:spacing w:after="140"/>
+      </w:pPr>
+      <w:r>
+        <w:rPr>
+          <w:b/>
+          <w:bCs/>
+        </w:rPr>
+        <w:t xml:space="preserve">Added during implementation (not in the original design pass): </w:t>
+      </w:r>
+      <w:r>
+        <w:t xml:space="preserve">SlotInfo and RuleContext — two small data-carrier classes that emerged once T9 (conflict detection) and the approval gate needed a richer shape than the original contract anticipated (SlotInfo gained resource_key and start so the store could actually compare two bookings; RuleContext groups what the gate found — missing fields, rule violations, and which require approval — into one typed object). Both are dependency (..&gt;) relationships, not new core responsibilities: they change what shape the existing arrows carry, not who talks to whom. See PLAN.md section 7 for the fuller account.</w:t>
       </w:r>
     </w:p>
     <w:p>

</xml_diff>

<commit_message>
Close remaining T15 follow-ups: plan-vs-actual writeup, regenerate UML_Diagrams.docx (#33)
- PLAN.md: fill in section 7 (plan vs. actual) from real commit history
- diagrams/DIAGRAMS.md + UML_Diagrams.docx: sync class diagram section
  with SlotInfo/RuleContext, added during T9 but missed in the T15 docx export
- HANDOVER.md: remove the now-resolved diagram-staleness gap
</commit_message>
<xml_diff>
--- a/diagrams/UML_Diagrams.docx
+++ b/diagrams/UML_Diagrams.docx
@@ -22,7 +22,7 @@
           <w:sz w:val="18"/>
           <w:szCs w:val="18"/>
         </w:rPr>
-        <w:t xml:space="preserve">EAIS-HR-2159-TA-01 — companion to PLAN.md and ARCHITECTURE.md</w:t>
+        <w:t xml:space="preserve">EAIS-HR-2159-TA-01 — companion to PLAN.md and ARCHITECTURE.md (regenerated post-T15, includes SlotInfo/RuleContext)</w:t>
       </w:r>
     </w:p>
     <w:p>
@@ -227,7 +227,7 @@
       <w:r>
         <w:drawing>
           <wp:inline distT="0" distB="0" distL="0" distR="0">
-            <wp:extent cx="5905500" cy="3429000"/>
+            <wp:extent cx="5334000" cy="3619500"/>
             <wp:effectExtent t="0" r="0" b="0" l="0"/>
             <wp:docPr id="1" name="" descr="" title=""/>
             <wp:cNvGraphicFramePr>
@@ -252,7 +252,7 @@
                   <pic:spPr bwMode="auto">
                     <a:xfrm>
                       <a:off x="0" y="0"/>
-                      <a:ext cx="5905500" cy="3429000"/>
+                      <a:ext cx="5334000" cy="3619500"/>
                     </a:xfrm>
                     <a:prstGeom prst="rect">
                       <a:avLst/>
@@ -472,7 +472,7 @@
       <w:r>
         <w:drawing>
           <wp:inline distT="0" distB="0" distL="0" distR="0">
-            <wp:extent cx="5905500" cy="1714500"/>
+            <wp:extent cx="5905500" cy="1666875"/>
             <wp:effectExtent t="0" r="0" b="0" l="0"/>
             <wp:docPr id="1" name="" descr="" title=""/>
             <wp:cNvGraphicFramePr>
@@ -497,7 +497,7 @@
                   <pic:spPr bwMode="auto">
                     <a:xfrm>
                       <a:off x="0" y="0"/>
-                      <a:ext cx="5905500" cy="1714500"/>
+                      <a:ext cx="5905500" cy="1666875"/>
                     </a:xfrm>
                     <a:prstGeom prst="rect">
                       <a:avLst/>
@@ -569,6 +569,21 @@
       </w:r>
       <w:r>
         <w:t xml:space="preserve">, not by branching inside the core on "are we in test mode."</w:t>
+      </w:r>
+    </w:p>
+    <w:p>
+      <w:pPr>
+        <w:spacing w:after="140"/>
+      </w:pPr>
+      <w:r>
+        <w:rPr>
+          <w:b/>
+          <w:bCs/>
+        </w:rPr>
+        <w:t xml:space="preserve">Added during implementation (not in the original design pass): </w:t>
+      </w:r>
+      <w:r>
+        <w:t xml:space="preserve">SlotInfo and RuleContext — two small data-carrier classes that emerged once T9 (conflict detection) and the approval gate needed a richer shape than the original contract anticipated (SlotInfo gained resource_key and start so the store could actually compare two bookings; RuleContext groups what the gate found — missing fields, rule violations, and which require approval — into one typed object). Both are dependency (..&gt;) relationships, not new core responsibilities: they change what shape the existing arrows carry, not who talks to whom. See PLAN.md section 7 for the fuller account.</w:t>
       </w:r>
     </w:p>
     <w:p>

</xml_diff>